<commit_message>
feat: Add universal header, pages, and fix module completion status
- Create universal header with navigation (Home, Resources, Contact, Profile)
- Add new pages: Home, Contact, Profile, Resources with beautiful UI
- Fix module completion status - modules with 100% progress now show as 'completed'
- Add 'Redo Assessment' functionality for scales with delete endpoint
- Update scale completion to use backend data instead of localStorage
- Add 4 new scale components (Parental Self-Efficacy, Parent-Child Relationship, etc.)
- Implement ScaleFlow for sequential scale completion
- Remove unused files and clean up routing
- Add proper TypeScript types and fix lint errors
</commit_message>
<xml_diff>
--- a/src/components/scales/Child's mental healthdocx.docx
+++ b/src/components/scales/Child's mental healthdocx.docx
@@ -3621,6 +3621,84 @@
         </w:rPr>
         <w:t>Always</w:t>
       </w:r>
+    </w:p>
+    <w:p>
+      <w:pPr>
+        <w:shd w:val="clear" w:color="auto" w:fill="FFFFFF"/>
+        <w:spacing w:after="84" w:line="240" w:lineRule="auto"/>
+        <w:rPr>
+          <w:rFonts w:ascii="Helvetica" w:eastAsia="Times New Roman" w:hAnsi="Helvetica" w:cs="Helvetica"/>
+          <w:color w:val="000000"/>
+          <w:spacing w:val="2"/>
+          <w:sz w:val="18"/>
+          <w:szCs w:val="18"/>
+        </w:rPr>
+      </w:pPr>
+    </w:p>
+    <w:p>
+      <w:pPr>
+        <w:shd w:val="clear" w:color="auto" w:fill="FFFFFF"/>
+        <w:spacing w:after="84" w:line="240" w:lineRule="auto"/>
+        <w:rPr>
+          <w:rFonts w:ascii="Helvetica" w:eastAsia="Times New Roman" w:hAnsi="Helvetica" w:cs="Helvetica"/>
+          <w:color w:val="000000"/>
+          <w:spacing w:val="2"/>
+          <w:sz w:val="18"/>
+          <w:szCs w:val="18"/>
+        </w:rPr>
+      </w:pPr>
+    </w:p>
+    <w:p>
+      <w:pPr>
+        <w:shd w:val="clear" w:color="auto" w:fill="FFFFFF"/>
+        <w:spacing w:after="84" w:line="240" w:lineRule="auto"/>
+        <w:rPr>
+          <w:rFonts w:ascii="Helvetica" w:eastAsia="Times New Roman" w:hAnsi="Helvetica" w:cs="Helvetica"/>
+          <w:color w:val="000000"/>
+          <w:spacing w:val="2"/>
+          <w:sz w:val="18"/>
+          <w:szCs w:val="18"/>
+        </w:rPr>
+      </w:pPr>
+    </w:p>
+    <w:p>
+      <w:pPr>
+        <w:shd w:val="clear" w:color="auto" w:fill="FFFFFF"/>
+        <w:spacing w:after="84" w:line="240" w:lineRule="auto"/>
+        <w:rPr>
+          <w:rFonts w:ascii="Helvetica" w:eastAsia="Times New Roman" w:hAnsi="Helvetica" w:cs="Helvetica"/>
+          <w:color w:val="000000"/>
+          <w:spacing w:val="2"/>
+          <w:sz w:val="18"/>
+          <w:szCs w:val="18"/>
+        </w:rPr>
+      </w:pPr>
+    </w:p>
+    <w:p>
+      <w:pPr>
+        <w:shd w:val="clear" w:color="auto" w:fill="FFFFFF"/>
+        <w:spacing w:after="84" w:line="240" w:lineRule="auto"/>
+        <w:rPr>
+          <w:rFonts w:ascii="Helvetica" w:eastAsia="Times New Roman" w:hAnsi="Helvetica" w:cs="Helvetica"/>
+          <w:color w:val="000000"/>
+          <w:spacing w:val="2"/>
+          <w:sz w:val="18"/>
+          <w:szCs w:val="18"/>
+        </w:rPr>
+      </w:pPr>
+    </w:p>
+    <w:p>
+      <w:pPr>
+        <w:shd w:val="clear" w:color="auto" w:fill="FFFFFF"/>
+        <w:spacing w:after="84" w:line="240" w:lineRule="auto"/>
+        <w:rPr>
+          <w:rFonts w:ascii="Helvetica" w:eastAsia="Times New Roman" w:hAnsi="Helvetica" w:cs="Helvetica"/>
+          <w:color w:val="000000"/>
+          <w:spacing w:val="2"/>
+          <w:sz w:val="18"/>
+          <w:szCs w:val="18"/>
+        </w:rPr>
+      </w:pPr>
     </w:p>
     <w:sectPr>
       <w:pgSz w:w="12240" w:h="15840"/>

</xml_diff>